<commit_message>
feat(v8-cad): integrate upright joined cad models and robust table layouts into 50-page master engineering dossier
</commit_message>
<xml_diff>
--- a/toor_dal_optimization/deliverables/V8_CLIENT_ONBOARDING_AND_ENGINEERING/CLIENT_PROJECT_PROPOSAL.docx
+++ b/toor_dal_optimization/deliverables/V8_CLIENT_ONBOARDING_AND_ENGINEERING/CLIENT_PROJECT_PROPOSAL.docx
@@ -4212,6 +4212,109 @@
           </w:p>
         </w:tc>
       </w:tr>
+      <w:tr>
+        <w:trPr>
+          <w:cantSplit/>
+        </w:trPr>
+        <w:tc>
+          <w:tcPr>
+            <w:tcW w:type="dxa" w:w="1440"/>
+            <w:shd w:val="clear" w:color="auto" w:fill="EFF6FF"/>
+            <w:tcMar>
+              <w:top w:w="40" w:type="dxa"/>
+              <w:bottom w:w="40" w:type="dxa"/>
+              <w:left w:w="60" w:type="dxa"/>
+              <w:right w:w="60" w:type="dxa"/>
+            </w:tcMar>
+          </w:tcPr>
+          <w:p>
+            <w:pPr>
+              <w:spacing w:before="40" w:after="40" w:line="264" w:lineRule="auto"/>
+              <w:jc w:val="center"/>
+            </w:pPr>
+            <w:r>
+              <w:rPr>
+                <w:sz w:val="17"/>
+              </w:rPr>
+              <w:t>Master Dossier (50 Pages)</w:t>
+            </w:r>
+          </w:p>
+        </w:tc>
+        <w:tc>
+          <w:tcPr>
+            <w:tcW w:type="dxa" w:w="3269"/>
+            <w:shd w:val="clear" w:color="auto" w:fill="EFF6FF"/>
+            <w:tcMar>
+              <w:top w:w="40" w:type="dxa"/>
+              <w:bottom w:w="40" w:type="dxa"/>
+              <w:left w:w="60" w:type="dxa"/>
+              <w:right w:w="60" w:type="dxa"/>
+            </w:tcMar>
+          </w:tcPr>
+          <w:p>
+            <w:pPr>
+              <w:spacing w:before="40" w:after="40" w:line="264" w:lineRule="auto"/>
+              <w:jc w:val="left"/>
+            </w:pPr>
+            <w:r>
+              <w:rPr>
+                <w:sz w:val="17"/>
+              </w:rPr>
+              <w:t>FINNOAQ_15TPD_MASTER_INTEGRATED_ENGINEERING_DOCUMENT.pdf</w:t>
+            </w:r>
+          </w:p>
+        </w:tc>
+        <w:tc>
+          <w:tcPr>
+            <w:tcW w:type="dxa" w:w="3168"/>
+            <w:shd w:val="clear" w:color="auto" w:fill="EFF6FF"/>
+            <w:tcMar>
+              <w:top w:w="40" w:type="dxa"/>
+              <w:bottom w:w="40" w:type="dxa"/>
+              <w:left w:w="60" w:type="dxa"/>
+              <w:right w:w="60" w:type="dxa"/>
+            </w:tcMar>
+          </w:tcPr>
+          <w:p>
+            <w:pPr>
+              <w:spacing w:before="40" w:after="40" w:line="264" w:lineRule="auto"/>
+              <w:jc w:val="left"/>
+            </w:pPr>
+            <w:r>
+              <w:rPr>
+                <w:sz w:val="17"/>
+              </w:rPr>
+              <w:t>Complete 50-page Master Integrated Engineering Dossier: AutoCAD 2D Drawings paired with SolidWorks 3D Models in Upright Human Orientation, 8 Dedicated Joined Plant Exhibition Sheets, Dual-Pane Suite, and Aspen V14 simulation.</w:t>
+            </w:r>
+          </w:p>
+        </w:tc>
+        <w:tc>
+          <w:tcPr>
+            <w:tcW w:type="dxa" w:w="1728"/>
+            <w:shd w:val="clear" w:color="auto" w:fill="EFF6FF"/>
+            <w:tcMar>
+              <w:top w:w="40" w:type="dxa"/>
+              <w:bottom w:w="40" w:type="dxa"/>
+              <w:left w:w="60" w:type="dxa"/>
+              <w:right w:w="60" w:type="dxa"/>
+            </w:tcMar>
+          </w:tcPr>
+          <w:p>
+            <w:pPr>
+              <w:spacing w:before="40" w:after="40" w:line="264" w:lineRule="auto"/>
+              <w:jc w:val="left"/>
+            </w:pPr>
+            <w:r>
+              <w:rPr>
+                <w:sz w:val="17"/>
+              </w:rPr>
+              <w:t>AutoCAD + SolidWorks + Aspen</w:t>
+              <w:br/>
+              <w:t>29.67 MB | SHA-256 Verified</w:t>
+            </w:r>
+          </w:p>
+        </w:tc>
+      </w:tr>
     </w:tbl>
     <w:p>
       <w:pPr>

</xml_diff>